<commit_message>
Update paper test instructions for separate speaking marks and timing
</commit_message>
<xml_diff>
--- a/frontend/templates/Revision-Unit-7-Paper-Teacher-Instructions.docx
+++ b/frontend/templates/Revision-Unit-7-Paper-Teacher-Instructions.docx
@@ -7,7 +7,7 @@
         <w:pStyle w:val="Title"/>
       </w:pPr>
       <w:r>
-        <w:t>RT1 · инструкция по бумажному эксперименту</w:t>
+        <w:t>RT1 · Unit 7 · бумажный резерв</w:t>
       </w:r>
     </w:p>
     <w:p>
@@ -15,12 +15,12 @@
         <w:pStyle w:val="Heading1"/>
       </w:pPr>
       <w:r>
-        <w:t>Что печатать</w:t>
+        <w:t>1. Выберите комплект группы</w:t>
       </w:r>
     </w:p>
     <w:p>
       <w:r>
-        <w:t>Для 213 (Evolve 6) и 215 (Evolve 5): With-Reading-Preview.docx — первая страница содержит текст, остальные страницы тест. Для 214, 216 и 217: обычный Group-…-ZipGrade.docx. Бланки ZipGrade и эссе печатаются отдельно.</w:t>
+        <w:t>213 и 214 — Evolve 6; 215, 216, 217 — Evolve 5. Для каждой группы свой Group-…-ZipGrade.docx: общая часть и отдельная групповая лексика. Не заменяйте вариант другой группой. На листах заданий ответы не пишут.</w:t>
       </w:r>
     </w:p>
     <w:p>
@@ -28,12 +28,12 @@
         <w:pStyle w:val="Heading1"/>
       </w:pPr>
       <w:r>
-        <w:t>Кто получает чтение</w:t>
+        <w:t>2. Что печатать</w:t>
       </w:r>
     </w:p>
     <w:p>
       <w:r>
-        <w:t>Только согласившиеся на исследование студенты групп 213 и 215. Отказавшиеся выполняют обычный тест без чтения. Они не становятся контрольной группой: просто исключаются из исследовательской выборки.</w:t>
+        <w:t>На студента: задания своей группы, официальный бланк ZipGrade на 20 вопросов и двусторонний бланк эссе своего учебника. На преподавателя: ключи и инструкция. Карточки speaking распечатайте и разрежьте; для RT1 используйте только Unit 7, хотя в файлах есть Units 7–9.</w:t>
       </w:r>
     </w:p>
     <w:p>
@@ -41,12 +41,12 @@
         <w:pStyle w:val="Heading1"/>
       </w:pPr>
       <w:r>
-        <w:t>Порядок выдачи</w:t>
+        <w:t>3. Бланк эссе</w:t>
       </w:r>
     </w:p>
     <w:p>
       <w:r>
-        <w:t>Не выдавайте весь пакет сразу. Отделите первую страницу, раздайте её участникам, предложите прочитать текст. Не просите учить слова и не выделяйте целевую лексику. Перед выдачей теста соберите листы с текстом. Можно печатать отдельный Reading-Preview.pdf вместо первой страницы пакета.</w:t>
+        <w:t>Essay-A5.pdf: двусторонняя печать на A5. Essay-A4-duplex.pdf: A4, альбомная ориентация, масштаб 100%, двусторонняя печать с переворотом по короткому краю; затем разрежьте пополам. Проверьте один пробный лист. DOCX — для редактирования.</w:t>
       </w:r>
     </w:p>
     <w:p>
@@ -54,12 +54,12 @@
         <w:pStyle w:val="Heading1"/>
       </w:pPr>
       <w:r>
-        <w:t>Одинаковые условия</w:t>
+        <w:t>4. Сначала добровольное согласие</w:t>
       </w:r>
     </w:p>
     <w:p>
       <w:r>
-        <w:t>Используйте одинаковую процедуру чтения для участников. Запишите фактическое время чтения и любые отклонения; новый фиксированный лимит здесь не вводится. Чтение не оценивается, письменные задания и максимум 3 балла за весь RT1 сохраняются.</w:t>
+        <w:t>До выдачи текста раздайте бланк эссе: на нём имя, группа и два варианта согласия. Объясните: участие добровольное; отказ не влияет на учебную оценку; можно выполнять тот же тест без исследования. Проверьте, что отмечен один вариант. Отказавшихся не переводите в контрольную группу и не включайте в исследовательский анализ.</w:t>
       </w:r>
     </w:p>
     <w:p>
@@ -67,12 +67,12 @@
         <w:pStyle w:val="Heading1"/>
       </w:pPr>
       <w:r>
-        <w:t>Эссе и устная часть</w:t>
+        <w:t>5. Эксперимент и контроль</w:t>
       </w:r>
     </w:p>
     <w:p>
       <w:r>
-        <w:t>Эссе пишется на отдельном двустороннем листе; вопросы speaking выдаются по команде преподавателя. Не требуйте обязательного употребления слов из текста. Самостоятельное употребление лексики оценивается отдельно.</w:t>
+        <w:t>213 и 215 — experimental: только согласившимся выдать Reading-Preview.pdf своего учебника. 214, 216, 217 — control: без предварительного чтения. Отказавшиеся из любой группы — обычное учебное тестирование без preview. With-Reading-Preview.docx включает текст первой страницей и задания далее: отделите их заранее и выдавайте по очереди.</w:t>
       </w:r>
     </w:p>
     <w:p>
@@ -80,12 +80,12 @@
         <w:pStyle w:val="Heading1"/>
       </w:pPr>
       <w:r>
-        <w:t>Что фиксировать</w:t>
+        <w:t>6. Чтение перед тестом</w:t>
       </w:r>
     </w:p>
     <w:p>
       <w:r>
-        <w:t>Группу, согласие, бумажный формат, фактическую выдачу/прочтение preview, начало/конец теста, результат по разделам, эссе и speaking. У бумажного формата нет электронных времён реакции по вопросам; не приписывайте ему такие данные.</w:t>
+        <w:t>Используйте одинаковую процедуру чтения для участников исследования и фиксируйте фактическое время. Не просите запоминать слова и не выделяйте целевую лексику. Соберите preview до выдачи заданий. Чтение не оценивается. Отдельных дополнительных оцениваемых заданий для experimental нет: отличие состоит в предварительном чтении.</w:t>
       </w:r>
     </w:p>
     <w:p>
@@ -93,12 +93,77 @@
         <w:pStyle w:val="Heading1"/>
       </w:pPr>
       <w:r>
-        <w:t>Speaking · критерии</w:t>
+        <w:t>7. ZipGrade</w:t>
       </w:r>
     </w:p>
     <w:p>
       <w:r>
-        <w:t>Индивидуальный ответ: Vocabulary, Grammar, Coherence, Content — каждый критерий 0–5. Диалог: Vocabulary, Grammar, Coherence, Communication strategies — каждый критерий 0–5. Итог speaking = среднее двух оценок из 20. Ситуации для диалога и пары организует преподаватель; онлайн-открытие диалога не требуется.</w:t>
+        <w:t>Создайте пять отдельных quizzes по 20 вопросов, с вариантами A–E, и внесите ключ своей группы. На всех бланках Test Version A, если поле используется: номера групп не являются буквами вариантов. Студенты заполняют Name, дату и номер группы в Period; отмечают один ответ на вопрос. Официальный бланк печатайте целиком, без изменения маркеров и обрезки.</w:t>
+      </w:r>
+    </w:p>
+    <w:p>
+      <w:pPr>
+        <w:pStyle w:val="Heading1"/>
+      </w:pPr>
+      <w:r>
+        <w:t>8. Эссе</w:t>
+      </w:r>
+    </w:p>
+    <w:p>
+      <w:r>
+        <w:t>Около 250 слов, ориентир 225–275. Писать самостоятельно, без ИИ и копирования текста preview или заданий. Оценить Content, Organisation, Grammar, Vocabulary — каждый 0–5. Итог эссе /20 — целое число; половина балла округляется вверх. Употребление целевой лексики и грамматики отмечать по фактическим примерам, не требовать обязательного количества единиц от студента.</w:t>
+      </w:r>
+    </w:p>
+    <w:p>
+      <w:pPr>
+        <w:pStyle w:val="Heading1"/>
+      </w:pPr>
+      <w:r>
+        <w:t>9. Speaking</w:t>
+      </w:r>
+    </w:p>
+    <w:p>
+      <w:r>
+        <w:t>Вызывать студентов после письменной части. Индивидуальный вопрос: открыть/выдать при вызове, сразу ответить 60–90 секунд без подготовки. После двух индивидуальных ответов назначить пару; одновременное завершение письменной части не требуется. Выдать одну ситуацию с ролями A/B: 30 секунд на чтение, затем 60 секунд на подготовку и 2–3 минуты диалога. При нечётном количестве диалог возможен с преподавателем.</w:t>
+      </w:r>
+    </w:p>
+    <w:p>
+      <w:pPr>
+        <w:pStyle w:val="Heading1"/>
+      </w:pPr>
+      <w:r>
+        <w:t>10. Две оценки за устную часть</w:t>
+      </w:r>
+    </w:p>
+    <w:p>
+      <w:r>
+        <w:t>Индивидуальный ответ: Vocabulary, Grammar, Coherence, Content — каждый 0–5; отдельный итог /20. Диалог: Vocabulary, Grammar, Coherence, Communication strategies — каждый 0–5; отдельный итог /20. Оба итога целые, половина балла округляется вверх. Общий speaking = среднее двух итогов /20, округлённое до целого вверх при .5. Не состоявшийся ответ оставьте неоценённым, не ставьте автоматически ноль.</w:t>
+      </w:r>
+    </w:p>
+    <w:p>
+      <w:pPr>
+        <w:pStyle w:val="Heading1"/>
+      </w:pPr>
+      <w:r>
+        <w:t>11. Подсчёт рейтинга</w:t>
+      </w:r>
+    </w:p>
+    <w:p>
+      <w:r>
+        <w:t>V = число верных ответов 1–8; G = число верных 9–16; E = число верных 17–20. Лексика/грамматика из 80: 40×V/8 + 25×G/8 + 15×E/4. Письменный итог из 100 = результат из 80 + эссе из 20. Рейтинг за весь RT1 = (результат из 80 + эссе из 20 + общий speaking из 20) /120 ×3, округление до двух знаков. Максимум 3 балла. Не подменяйте эту формулу сырым результатом ZipGrade из 20. Если эссе или speaking не оценены, финальный рейтинг пока не рассчитывается.</w:t>
+      </w:r>
+    </w:p>
+    <w:p>
+      <w:pPr>
+        <w:pStyle w:val="Heading1"/>
+      </w:pPr>
+      <w:r>
+        <w:t>12. Данные исследования</w:t>
+      </w:r>
+    </w:p>
+    <w:p>
+      <w:r>
+        <w:t>Зафиксируйте группу, согласие, формат paper, фактическое получение preview, время начала/окончания, оценки по разделам и двум устным частям, эссе и отклонения от процедуры. Не смешивайте бумажные и онлайн-результаты без отметки формата. Бумага не даёт времени реакции по каждому вопросу или данных о переключении вкладок. Отказавшиеся сохраняются в учебном учёте, но исключаются из исследовательской выборки.</w:t>
       </w:r>
     </w:p>
     <w:sectPr>

</xml_diff>